<commit_message>
docs: update syllabus to clarify sustainability connection and classroom culture
</commit_message>
<xml_diff>
--- a/comp364-syllabus-8-11-2026.docx
+++ b/comp364-syllabus-8-11-2026.docx
@@ -195,21 +195,12 @@
           <w:szCs w:val="22"/>
         </w:rPr>
       </w:pPr>
-      <w:proofErr w:type="gramStart"/>
-      <w:r>
-        <w:rPr>
-          <w:sz w:val="22"/>
-          <w:szCs w:val="22"/>
-        </w:rPr>
-        <w:t>strengthen</w:t>
-      </w:r>
-      <w:proofErr w:type="gramEnd"/>
-      <w:r>
-        <w:rPr>
-          <w:sz w:val="22"/>
-          <w:szCs w:val="22"/>
-        </w:rPr>
-        <w:t xml:space="preserve"> skills for implementing and analyzing algorithms</w:t>
+      <w:r>
+        <w:rPr>
+          <w:sz w:val="22"/>
+          <w:szCs w:val="22"/>
+        </w:rPr>
+        <w:t>strengthen skills for implementing and analyzing algorithms</w:t>
       </w:r>
     </w:p>
     <w:p>
@@ -226,20 +217,79 @@
       </w:pPr>
       <w:r>
         <w:rPr>
-          <w:sz w:val="22"/>
-          <w:szCs w:val="22"/>
-        </w:rPr>
-        <w:t>[sustainability connection/SCON goal] Think critically about a sustainability question, problem, or solution.</w:t>
-      </w:r>
-    </w:p>
-    <w:p>
-      <w:pPr>
-        <w:pStyle w:val="ListParagraph"/>
-        <w:rPr>
-          <w:sz w:val="22"/>
-          <w:szCs w:val="22"/>
-        </w:rPr>
-      </w:pPr>
+          <w:i/>
+          <w:iCs/>
+          <w:sz w:val="22"/>
+          <w:szCs w:val="22"/>
+        </w:rPr>
+        <w:t>sustainability connection</w:t>
+      </w:r>
+      <w:r>
+        <w:rPr>
+          <w:i/>
+          <w:iCs/>
+          <w:sz w:val="22"/>
+          <w:szCs w:val="22"/>
+        </w:rPr>
+        <w:t xml:space="preserve"> (</w:t>
+      </w:r>
+      <w:r>
+        <w:rPr>
+          <w:i/>
+          <w:iCs/>
+          <w:sz w:val="22"/>
+          <w:szCs w:val="22"/>
+        </w:rPr>
+        <w:t>SCON</w:t>
+      </w:r>
+      <w:r>
+        <w:rPr>
+          <w:i/>
+          <w:iCs/>
+          <w:sz w:val="22"/>
+          <w:szCs w:val="22"/>
+        </w:rPr>
+        <w:t>)</w:t>
+      </w:r>
+      <w:r>
+        <w:rPr>
+          <w:i/>
+          <w:iCs/>
+          <w:sz w:val="22"/>
+          <w:szCs w:val="22"/>
+        </w:rPr>
+        <w:t xml:space="preserve"> goal</w:t>
+      </w:r>
+      <w:r>
+        <w:rPr>
+          <w:i/>
+          <w:iCs/>
+          <w:sz w:val="22"/>
+          <w:szCs w:val="22"/>
+        </w:rPr>
+        <w:t>:</w:t>
+      </w:r>
+      <w:r>
+        <w:rPr>
+          <w:sz w:val="22"/>
+          <w:szCs w:val="22"/>
+        </w:rPr>
+        <w:t xml:space="preserve"> </w:t>
+      </w:r>
+      <w:r>
+        <w:rPr>
+          <w:sz w:val="22"/>
+          <w:szCs w:val="22"/>
+        </w:rPr>
+        <w:t>t</w:t>
+      </w:r>
+      <w:r>
+        <w:rPr>
+          <w:sz w:val="22"/>
+          <w:szCs w:val="22"/>
+        </w:rPr>
+        <w:t>hink critically about a sustainability question, problem, or solution</w:t>
+      </w:r>
     </w:p>
     <w:p>
       <w:pPr>
@@ -261,37 +311,38 @@
           <w:sz w:val="22"/>
           <w:szCs w:val="22"/>
         </w:rPr>
-        <w:t xml:space="preserve">Everyone </w:t>
-      </w:r>
-      <w:proofErr w:type="gramStart"/>
-      <w:r>
-        <w:rPr>
-          <w:sz w:val="22"/>
-          <w:szCs w:val="22"/>
-        </w:rPr>
-        <w:t>in</w:t>
-      </w:r>
-      <w:proofErr w:type="gramEnd"/>
-      <w:r>
-        <w:rPr>
-          <w:sz w:val="22"/>
-          <w:szCs w:val="22"/>
-        </w:rPr>
-        <w:t xml:space="preserve"> the course belongs equally to our classroom community. The instructor aims to create an atmosphere where everyone feels a sense of belonging and feels free to ask questions.</w:t>
-      </w:r>
-    </w:p>
-    <w:p>
-      <w:pPr>
-        <w:rPr>
-          <w:sz w:val="22"/>
-          <w:szCs w:val="22"/>
-        </w:rPr>
-      </w:pPr>
+        <w:t>All students in the course</w:t>
+      </w:r>
+      <w:r>
+        <w:rPr>
+          <w:sz w:val="22"/>
+          <w:szCs w:val="22"/>
+        </w:rPr>
+        <w:t xml:space="preserve"> belong equally to our classroom community. The instructor aims to create an atmosphere where everyone feels a sense of belonging and feels free to ask questions.</w:t>
+      </w:r>
     </w:p>
     <w:p>
       <w:pPr>
         <w:pStyle w:val="Heading3"/>
       </w:pPr>
+      <w:r>
+        <w:t xml:space="preserve">Sustainability Connection (SCON) attribute </w:t>
+      </w:r>
+    </w:p>
+    <w:p>
+      <w:pPr>
+        <w:rPr>
+          <w:sz w:val="22"/>
+          <w:szCs w:val="22"/>
+        </w:rPr>
+      </w:pPr>
+      <w:r>
+        <w:rPr>
+          <w:sz w:val="22"/>
+          <w:szCs w:val="22"/>
+        </w:rPr>
+        <w:t>This class has the Dickinson sustainability connection (SCON) attribute. The class includes a topic on the positive and negative impacts of artificial intelligence on sustainability.</w:t>
+      </w:r>
     </w:p>
     <w:p>
       <w:pPr>
@@ -390,11 +441,6 @@
         </w:rPr>
         <w:t>Homework and exams to reinforce understanding of concepts</w:t>
       </w:r>
-    </w:p>
-    <w:p>
-      <w:pPr>
-        <w:pStyle w:val="Heading3"/>
-      </w:pPr>
     </w:p>
     <w:p>
       <w:pPr>
@@ -537,11 +583,6 @@
       <w:pPr>
         <w:pStyle w:val="Heading3"/>
       </w:pPr>
-    </w:p>
-    <w:p>
-      <w:pPr>
-        <w:pStyle w:val="Heading3"/>
-      </w:pPr>
       <w:r>
         <w:t>Books</w:t>
       </w:r>
@@ -695,7 +736,6 @@
         <w:pStyle w:val="Heading3"/>
       </w:pPr>
       <w:r>
-        <w:lastRenderedPageBreak/>
         <w:t xml:space="preserve">Assessment and </w:t>
       </w:r>
       <w:r>
@@ -1633,23 +1673,7 @@
           <w:sz w:val="22"/>
           <w:szCs w:val="22"/>
         </w:rPr>
-        <w:t xml:space="preserve"> or homework assignment is eligible to appear in the midterm exams. In practice, a strong majority of exam questions will be </w:t>
-      </w:r>
-      <w:proofErr w:type="gramStart"/>
-      <w:r>
-        <w:rPr>
-          <w:sz w:val="22"/>
-          <w:szCs w:val="22"/>
-        </w:rPr>
-        <w:t>similar to</w:t>
-      </w:r>
-      <w:proofErr w:type="gramEnd"/>
-      <w:r>
-        <w:rPr>
-          <w:sz w:val="22"/>
-          <w:szCs w:val="22"/>
-        </w:rPr>
-        <w:t xml:space="preserve"> a homework question, </w:t>
+        <w:t xml:space="preserve"> or homework assignment is eligible to appear in the midterm exams. In practice, a strong majority of exam questions will be similar to a homework question, </w:t>
       </w:r>
       <w:r>
         <w:rPr>
@@ -1750,7 +1774,6 @@
         <w:pStyle w:val="Heading3"/>
       </w:pPr>
       <w:r>
-        <w:lastRenderedPageBreak/>
         <w:t>Plagiarism, copying, collaborating</w:t>
       </w:r>
       <w:r>
@@ -1914,11 +1937,9 @@
       <w:pPr>
         <w:pStyle w:val="Heading3"/>
       </w:pPr>
-      <w:proofErr w:type="gramStart"/>
       <w:r>
         <w:t>Accommodations</w:t>
       </w:r>
-      <w:proofErr w:type="gramEnd"/>
     </w:p>
     <w:p>
       <w:pPr>

</xml_diff>